<commit_message>
Rework: surface flagship achievements, add Initiatives, COGA-friendly accessible web CV, verified publication links
Co-Authored-By: Claude Opus 4.7 <noreply@anthropic.com>
</commit_message>
<xml_diff>
--- a/Deepa_Palaniappan_CV_2026.docx
+++ b/Deepa_Palaniappan_CV_2026.docx
@@ -74,7 +74,7 @@
           <w:i w:val="0"/>
           <w:sz w:val="21"/>
         </w:rPr>
-        <w:t>Disability inclusion, accessibility and policy professional with over a decade of experience across government, United Nations and World Bank systems, academia and grassroots practice. Assistant Professor at Azim Premji University; consultant to the WHO Disability Unit, Geneva (two assignments) and the World Bank; and State Disability Consultant to the Governments of Bihar, Odisha and Tamil Nadu. Work spans policy drafting and analysis, research and documentation, curriculum and training-material development, and capacity building of government officers and institutional cadres. IAAP-certified accessibility professional (CPACC) with applied expertise in assistive technology, document accessibility and built-environment accessibility.</w:t>
+        <w:t>Disability inclusion, accessibility and policy professional with over a decade of experience across government, United Nations and World Bank systems, academia and grassroots practice. Named contributor to the WHO Global Report on Health Equity for Persons with Disabilities (2022). Developed the Bihar State Disability Inclusion Guideline, in implementation since 2020, and is currently one of two members of the committee drafting the Tamil Nadu State Disability Policy. Assistant Professor at Azim Premji University, and consultant to the WHO Disability Unit, Geneva (two assignments) and the World Bank. IAAP-certified accessibility professional (CPACC) with applied expertise in assistive technology, document accessibility and built-environment accessibility, and founder of the Disability Rights Repository and EquitableDocs initiatives.</w:t>
       </w:r>
     </w:p>
     <w:p>
@@ -217,13 +217,13 @@
         <w:rPr>
           <w:sz w:val="21"/>
         </w:rPr>
-        <w:t>•  Disability-inclusive development and mainstreaming</w:t>
+        <w:t>•  Disability policy: drafting, analysis and review</w:t>
       </w:r>
       <w:r>
         <w:rPr>
           <w:sz w:val="21"/>
         </w:rPr>
-        <w:t xml:space="preserve">      •  Disability policy drafting, analysis and review</w:t>
+        <w:t xml:space="preserve">      •  Disability-inclusive development and mainstreaming</w:t>
       </w:r>
     </w:p>
     <w:p>
@@ -235,7 +235,7 @@
         <w:rPr>
           <w:sz w:val="21"/>
         </w:rPr>
-        <w:t>•  Accessibility: digital, document and built environment</w:t>
+        <w:t>•  Accessibility: digital, document and built-environment</w:t>
       </w:r>
       <w:r>
         <w:rPr>
@@ -278,6 +278,127 @@
           <w:sz w:val="21"/>
         </w:rPr>
         <w:t xml:space="preserve">      •  Multi-stakeholder and inter-governmental coordination</w:t>
+      </w:r>
+    </w:p>
+    <w:p>
+      <w:pPr>
+        <w:spacing w:after="40" w:before="0" w:line="264" w:lineRule="auto"/>
+        <w:ind w:left="230" w:hanging="230"/>
+      </w:pPr>
+      <w:r>
+        <w:rPr>
+          <w:sz w:val="21"/>
+        </w:rPr>
+        <w:t>•  Large public-events accessibility planning and implementation</w:t>
+      </w:r>
+      <w:r>
+        <w:rPr>
+          <w:sz w:val="21"/>
+        </w:rPr>
+        <w:t xml:space="preserve">      •  Disability data, informatics and standards (Bureau of Indian Standards)</w:t>
+      </w:r>
+    </w:p>
+    <w:p>
+      <w:pPr>
+        <w:spacing w:after="60" w:before="180" w:line="264" w:lineRule="auto"/>
+        <w:pBdr>
+          <w:bottom w:val="single" w:sz="6" w:space="1" w:color="1F2937"/>
+        </w:pBdr>
+      </w:pPr>
+      <w:r>
+        <w:rPr>
+          <w:b/>
+          <w:i w:val="0"/>
+          <w:color w:val="1F2937"/>
+          <w:sz w:val="22"/>
+        </w:rPr>
+        <w:t>INITIATIVES</w:t>
+      </w:r>
+    </w:p>
+    <w:p>
+      <w:pPr>
+        <w:spacing w:after="40" w:before="0" w:line="264" w:lineRule="auto"/>
+        <w:ind w:left="230" w:hanging="230"/>
+      </w:pPr>
+      <w:r>
+        <w:rPr>
+          <w:sz w:val="21"/>
+        </w:rPr>
+        <w:t xml:space="preserve">•  </w:t>
+      </w:r>
+      <w:r>
+        <w:rPr>
+          <w:b/>
+          <w:sz w:val="21"/>
+        </w:rPr>
+        <w:t>Disability Rights Repository.</w:t>
+      </w:r>
+      <w:r>
+        <w:rPr>
+          <w:b w:val="0"/>
+          <w:sz w:val="21"/>
+        </w:rPr>
+        <w:t xml:space="preserve"> </w:t>
+      </w:r>
+      <w:hyperlink r:id="rId9">
+        <w:r>
+          <w:rPr>
+            <w:color w:val="1E40AF"/>
+            <w:u w:val="single"/>
+            <w:sz w:val="21"/>
+          </w:rPr>
+          <w:t xml:space="preserve">disability-rights-repository.org</w:t>
+        </w:r>
+      </w:hyperlink>
+      <w:r>
+        <w:rPr>
+          <w:b w:val="0"/>
+          <w:sz w:val="21"/>
+        </w:rPr>
+        <w:t>. Developed and maintains a web portal that builds the documentation capabilities of organisations of persons with disabilities, OPD leaders and patient advocates, and creates visibility for community-based grassroots practitioners.</w:t>
+      </w:r>
+    </w:p>
+    <w:p>
+      <w:pPr>
+        <w:spacing w:after="40" w:before="0" w:line="264" w:lineRule="auto"/>
+        <w:ind w:left="230" w:hanging="230"/>
+      </w:pPr>
+      <w:r>
+        <w:rPr>
+          <w:sz w:val="21"/>
+        </w:rPr>
+        <w:t xml:space="preserve">•  </w:t>
+      </w:r>
+      <w:r>
+        <w:rPr>
+          <w:b/>
+          <w:sz w:val="21"/>
+        </w:rPr>
+        <w:t>EquitableDocs.</w:t>
+      </w:r>
+      <w:r>
+        <w:rPr>
+          <w:b w:val="0"/>
+          <w:sz w:val="21"/>
+        </w:rPr>
+        <w:t xml:space="preserve"> </w:t>
+      </w:r>
+      <w:hyperlink r:id="rId10">
+        <w:r>
+          <w:rPr>
+            <w:color w:val="1E40AF"/>
+            <w:u w:val="single"/>
+            <w:sz w:val="21"/>
+          </w:rPr>
+          <w:t xml:space="preserve">equitabledocs.org</w:t>
+        </w:r>
+      </w:hyperlink>
+      <w:r>
+        <w:rPr>
+          <w:b w:val="0"/>
+          <w:sz w:val="21"/>
+        </w:rPr>
+        <w:t>. Founder of a document equity initiative providing accessible-document remediation for students at no cost and capacity-building partnerships for universities, with a Global South focus.</w:t>
       </w:r>
     </w:p>
     <w:p>
@@ -409,7 +530,7 @@
         </w:rPr>
         <w:t xml:space="preserve">Named contributor to the </w:t>
       </w:r>
-      <w:hyperlink r:id="rId9">
+      <w:hyperlink r:id="rId11">
         <w:r>
           <w:rPr>
             <w:color w:val="1E40AF"/>
@@ -764,7 +885,7 @@
         </w:rPr>
         <w:t xml:space="preserve">Named contributor, </w:t>
       </w:r>
-      <w:hyperlink r:id="rId9">
+      <w:hyperlink r:id="rId11">
         <w:r>
           <w:rPr>
             <w:color w:val="1E40AF"/>
@@ -799,42 +920,6 @@
           <w:sz w:val="21"/>
         </w:rPr>
         <w:t>Drafted a CBR policy and implementation inputs for the World Bank TN RIGHTS project; member of the committee drafting the Tamil Nadu State Disability Policy (2026).</w:t>
-      </w:r>
-    </w:p>
-    <w:p>
-      <w:pPr>
-        <w:spacing w:after="40" w:before="0" w:line="264" w:lineRule="auto"/>
-        <w:ind w:left="230" w:hanging="230"/>
-      </w:pPr>
-      <w:r>
-        <w:rPr>
-          <w:sz w:val="21"/>
-        </w:rPr>
-        <w:t xml:space="preserve">•  </w:t>
-      </w:r>
-      <w:r>
-        <w:rPr>
-          <w:b w:val="0"/>
-          <w:sz w:val="21"/>
-        </w:rPr>
-        <w:t>Developed and maintains a documentation and capacity-building web portal for practitioners and advocates (</w:t>
-      </w:r>
-      <w:hyperlink r:id="rId10">
-        <w:r>
-          <w:rPr>
-            <w:color w:val="1E40AF"/>
-            <w:u w:val="single"/>
-            <w:sz w:val="21"/>
-          </w:rPr>
-          <w:t xml:space="preserve">disability-rights-repository.org</w:t>
-        </w:r>
-      </w:hyperlink>
-      <w:r>
-        <w:rPr>
-          <w:b w:val="0"/>
-          <w:sz w:val="21"/>
-        </w:rPr>
-        <w:t>).</w:t>
       </w:r>
     </w:p>
     <w:p>
@@ -1060,7 +1145,7 @@
         </w:rPr>
         <w:t>“</w:t>
       </w:r>
-      <w:hyperlink r:id="rId11">
+      <w:hyperlink r:id="rId12">
         <w:r>
           <w:rPr>
             <w:color w:val="1E40AF"/>
@@ -1096,7 +1181,7 @@
         </w:rPr>
         <w:t>Friedner, M., Ghosh, N., and Palaniappan, D., “</w:t>
       </w:r>
-      <w:hyperlink r:id="rId12">
+      <w:hyperlink r:id="rId13">
         <w:r>
           <w:rPr>
             <w:color w:val="1E40AF"/>
@@ -1132,7 +1217,7 @@
         </w:rPr>
         <w:t xml:space="preserve">Palaniappan, D., and Rodrigues, V., “Disability within the Rawlsian Framework of Justice”, in A. Ghai (Ed.), </w:t>
       </w:r>
-      <w:hyperlink r:id="rId13">
+      <w:hyperlink r:id="rId14">
         <w:r>
           <w:rPr>
             <w:color w:val="1E40AF"/>
@@ -1187,7 +1272,7 @@
         </w:rPr>
         <w:t>“</w:t>
       </w:r>
-      <w:hyperlink r:id="rId14">
+      <w:hyperlink r:id="rId15">
         <w:r>
           <w:rPr>
             <w:color w:val="1E40AF"/>

</xml_diff>